<commit_message>
audio: calibrate all 4 scenario bonuses to exact 9-10 min practical format while preserving deep 15-18 min hypnosis for lesson practices
</commit_message>
<xml_diff>
--- a/baza/01_сценарий_я_выбираю_поиск_партнера/МЕДИТАЦИИ_СЦЕНАРИЙ_1_Я_ВЫБИРАЮ_МАГИГ.docx
+++ b/baza/01_сценарий_я_выбираю_поиск_партнера/МЕДИТАЦИИ_СЦЕНАРИЙ_1_Я_ВЫБИРАЮ_МАГИГ.docx
@@ -28,9 +28,9 @@
           <w:color w:val="555555"/>
           <w:sz w:val="22"/>
         </w:rPr>
-        <w:t>Монументальный свод 4-х полных трансовых сессий по методу Анатолия Фёдорова (МАГиГ)</w:t>
-        <w:br/>
-        <w:t>Уникальный атлас метафор: Вечерний сад, Мастерская часовщика, Средиземноморское поместье и Бархатная мантия</w:t>
+        <w:t>Монументальный свод 4-х трансовых сессий по методу Анатолия Фёдорова (МАГиГ)</w:t>
+        <w:br/>
+        <w:t>Уроки 0, 3, 5 (15–18 мин) + Прикладной бонус (10 мин)</w:t>
         <w:br/>
         <w:t>Спикер: Федоров Анатолий Игоревич (Семейный психолог, гипнолог, проректор МАГиГ)</w:t>
       </w:r>
@@ -57,18 +57,10 @@
       <w:r>
         <w:rPr>
           <w:rFonts w:ascii="Calibri" w:hAnsi="Calibri"/>
-          <w:b/>
-          <w:color w:val="C0392B"/>
-          <w:sz w:val="20"/>
+          <w:sz w:val="19"/>
         </w:rPr>
         <w:t>🧠 ТЕРАПЕВТИЧЕСКИЙ ПАСПОРТ И ПСИХОЛОГИЧЕСКИЕ МИШЕНИ</w:t>
         <w:br/>
-      </w:r>
-      <w:r>
-        <w:rPr>
-          <w:rFonts w:ascii="Calibri" w:hAnsi="Calibri"/>
-          <w:sz w:val="19"/>
-        </w:rPr>
         <w:t>• Главная мишень: Снятие напряжения после прохождения теста, первый соматический контакт с собой, безопасный вход в курс.</w:t>
         <w:br/>
         <w:t>• Соматический фокус: Мягкий расслабленный лоб, свободная челюсть, тепло кружки чая в ладонях, деревянное крыльцо сада.</w:t>
@@ -607,9 +599,9 @@
         <w:br/>
         <w:t>• Терапевтический результат: Ощущение собственной безусловной ценности: спокойный интерес вместо желания понравиться.</w:t>
         <w:br/>
-        <w:t>• Параметры начитки: Хронометраж 8–10 мин (~750 слов) | Музыка FlowMusic 528 Hz, До мажор</w:t>
-        <w:br/>
-        <w:t>• Архитектура Косички: А1 (Теплая бархатная мантия на плечах) ➔ Б1 (Снятие напряжения с лица, свободное дыхание) ➔ В (Ядро: Позиция исследователя — «подходит ли мне этот человек?», врожденная ценность) ➔ Б2 (Уверенные мягкие шаги и тепло в ладонях) ➔ А2 (Ясный открытый взгляд и спокойная улыбка)</w:t>
+        <w:t>• Параметры начитки: Хронометраж 9–10 мин (~800 слов) | Музыка FlowMusic 528 Hz, До мажор</w:t>
+        <w:br/>
+        <w:t>• Архитектура Косички: А1 (Бархатная мантия) ➔ Б1 (Снятие напряжения с лица) ➔ В (Ядро: Позиция исследователя) ➔ Б2 (Уверенные шаги) ➔ А2 (Ясный взгляд и улыбка)</w:t>
       </w:r>
     </w:p>
     <w:p>
@@ -621,70 +613,83 @@
           <w:rFonts w:ascii="Calibri" w:hAnsi="Calibri"/>
           <w:sz w:val="21"/>
         </w:rPr>
-        <w:t>[Музыкальное вступление: нежный, обволакивающий фон 528 Гц — Пауза 4 сек]</w:t>
+        <w:t>[Музыкальное вступление: мягкий, обволакивающий, придающий уверенность фон 528 Гц — Пауза 6 сек]</w:t>
         <w:br/>
         <w:br/>
         <w:t>Здравствуй. [Пауза 3 сек]</w:t>
         <w:br/>
-        <w:t xml:space="preserve">Устройся удобно, почувствуй стопами пол. </w:t>
-        <w:br/>
-        <w:t>Прямо сейчас, перед встречей, позволь себе сделать небольшую паузу и отпустить все лишнее волнение. [Пауза 4 сек]</w:t>
-        <w:br/>
-        <w:t>Сделай мягкий вдох животом... и длинный, плавный выдох через чуть приоткрытые губы. [Пауза 4 сек]</w:t>
-        <w:br/>
-        <w:t>И еще один вдох... и выдох, замедляющий любую спешку. [Пауза 4 сек]</w:t>
-        <w:br/>
-        <w:br/>
-        <w:t xml:space="preserve">Представь, что на твои плечи мягко ложится теплая, красивая бархатная мантия. </w:t>
-        <w:br/>
-        <w:t xml:space="preserve">Она мягкая, уютная и имеет приятный, успокаивающий вес. </w:t>
-        <w:br/>
-        <w:t xml:space="preserve">Эта тяжесть приятно заземляет тебя, снимая всю суету. </w:t>
-        <w:br/>
-        <w:t>Ты ступаешь мягко, спокойно и неспешно. [Пауза 5 сек]</w:t>
-        <w:br/>
-        <w:br/>
-        <w:t xml:space="preserve">Обрати внимание на лицо. </w:t>
+        <w:t>Устройся удобно, почувствуй, как твои стопы спокойно и плотно стоят на полу. [Пауза 4 сек]</w:t>
+        <w:br/>
+        <w:t xml:space="preserve">Прямо сейчас, перед тем как выйти за дверь или начать встречу, мы снимем с тебя всю суету. </w:t>
+        <w:br/>
+        <w:t>Весь этот мелкий тремор, спешку, внутреннее дребезжание и сомнения: «как всё пройдет?», «понравлюсь ли я?». [Пауза 5 сек]</w:t>
+        <w:br/>
+        <w:br/>
+        <w:t>Сделай глубокий вдох животом... [Пауза 3 сек]</w:t>
+        <w:br/>
+        <w:t>И длинный, плавный выдох через чуть приоткрытые губы. [Пауза 4 сек]</w:t>
+        <w:br/>
+        <w:t>И еще один вдох, расширяя ребра... И выдох, замедляющий любую внутреннюю спешку. [Пауза 5 сек]</w:t>
+        <w:br/>
+        <w:br/>
+        <w:t xml:space="preserve">Представь, что прямо сейчас на твои плечи мягко ложится теплая, царственная мантия. </w:t>
+        <w:br/>
+        <w:t xml:space="preserve">Она сшита из плотного темного бархата и подбита мягким согревающим мехом. </w:t>
+        <w:br/>
+        <w:t xml:space="preserve">Почувствуй ее приятный физический вес. </w:t>
+        <w:br/>
+        <w:t xml:space="preserve">Эта тяжесть мягко осаживает тебя. Она прижимает к земле всю ненужную суету. </w:t>
+        <w:br/>
+        <w:t>Люди в мантиях не бегают и не суетятся. Они ступают неспешно, весомо, наполняя собой пространство. [Пауза 6 сек]</w:t>
+        <w:br/>
+        <w:br/>
+        <w:t xml:space="preserve">Пройдись вниманием по лицу. </w:t>
+        <w:br/>
+        <w:t xml:space="preserve">Сними маску заискивания, маску «хорошей девочки» и желание всем угодить. </w:t>
         <w:br/>
         <w:t xml:space="preserve">Разгладь лоб... виски. </w:t>
         <w:br/>
         <w:t xml:space="preserve">Разомкни зубы, пусть нижняя челюсть станет абсолютно свободной. </w:t>
         <w:br/>
-        <w:t xml:space="preserve">Сними любое напряжение из глаз. Взгляд становится мягким, открытым и ясным. </w:t>
-        <w:br/>
-        <w:t>Тебе не нужно сдавать экзамен или пытаться понравиться. [Пауза 5 сек]</w:t>
+        <w:t xml:space="preserve">Сними напряженное ожидание из глаз. Взгляд становится мягким, открытым, спокойным и ясным. </w:t>
+        <w:br/>
+        <w:t>Тебе не нужно сдавать экзамен. Тебе не нужно никого очаровывать. [Пауза 6 сек]</w:t>
         <w:br/>
         <w:br/>
         <w:t>[Ядро: Позиция исследователя]</w:t>
         <w:br/>
-        <w:t xml:space="preserve">Услышь это сердцем: </w:t>
-        <w:br/>
-        <w:t xml:space="preserve">Ты идешь на встречу не для того, чтобы тебя оценивали. </w:t>
-        <w:br/>
-        <w:t xml:space="preserve">Ты идешь как исследователь своего собственного мира. </w:t>
-        <w:br/>
-        <w:t xml:space="preserve">Это ты смотришь, слушаешь и чувствуешь: </w:t>
-        <w:br/>
-        <w:t xml:space="preserve">«Интересен ли мне этот человек? Легко ли мне рядом с ним? Совпадают ли наши ценности?». </w:t>
-        <w:br/>
-        <w:br/>
-        <w:t xml:space="preserve">Твоя ценность уже с тобой — неизменная, врожденная, спокойная. </w:t>
-        <w:br/>
-        <w:t>Тебе достаточно просто быть собой: настоящей, живой, внимательной. [Пауза 6 сек]</w:t>
+        <w:t xml:space="preserve">Услышь меня очень внимательно. </w:t>
+        <w:br/>
+        <w:t xml:space="preserve">Ты идешь на встречу не на кастинг. Ты не товар на витрине, который ждет чьей-то оценки или одобрения. </w:t>
+        <w:br/>
+        <w:t xml:space="preserve">Ты — главный акционер и автор своей жизни. Ты — исследователь. </w:t>
+        <w:br/>
+        <w:t xml:space="preserve">Это ТЫ идешь смотреть. Это ТЫ исследуешь человека напротив: </w:t>
+        <w:br/>
+        <w:t>«Кто ты? Подходишь ли ты моему миру? Легко ли мне рядом с тобой? Способен ли ты на уважение, зрелость и искренность?». [Пауза 6 сек]</w:t>
+        <w:br/>
+        <w:br/>
+        <w:t xml:space="preserve">Твоя ценность безусловна и врождена. Ее не нужно доказывать или заслуживать. Она просто есть, как гравитация Земли. </w:t>
+        <w:br/>
+        <w:t xml:space="preserve">Почувствуй эту теплую, спокойную гравитацию в своем теле. </w:t>
+        <w:br/>
+        <w:t>Ты спокойна, как большая кошка на отдыхе: абсолютно расслаблена, но в любую секунду хозяйка ситуации. [Пауза 6 сек]</w:t>
         <w:br/>
         <w:br/>
         <w:t xml:space="preserve">Сейчас ты сделаешь шаг в свой день. </w:t>
         <w:br/>
-        <w:t xml:space="preserve">Твоя походка будет легкой и уверенной. </w:t>
-        <w:br/>
-        <w:t xml:space="preserve">Твой голос — спокойным и доброжелательным. </w:t>
-        <w:br/>
-        <w:t>А в глазах будет светиться легкая, теплая улыбка человека, который уверен в себе. [Пауза 5 сек]</w:t>
-        <w:br/>
-        <w:br/>
-        <w:t xml:space="preserve">Сделай глубокий вдох, ощути уют мантии на плечах... и мягкий выдох. </w:t>
-        <w:br/>
-        <w:t>Открывай глаза. Иди и наслаждайся встречей. [Музыкальное завершение — Пауза 5 сек]</w:t>
+        <w:t xml:space="preserve">Каждый твой шаг будет размеренным, устойчивым, полным тихого достоинства. </w:t>
+        <w:br/>
+        <w:t xml:space="preserve">Твой голос будет звучать чуть глубже, мягче и спокойнее. </w:t>
+        <w:br/>
+        <w:t>А в глазах будет светиться легкая, теплая полуулыбка человека, который знает главное: с тобой всё в полном порядке. [Пауза 6 сек]</w:t>
+        <w:br/>
+        <w:br/>
+        <w:t>Сделай глубокий вдох, ощущая уют и вес мантии на плечах... [Пауза 3 сек]</w:t>
+        <w:br/>
+        <w:t>И спокойный, освежающий выдох. [Пауза 4 сек]</w:t>
+        <w:br/>
+        <w:t>Открывай глаза. Иди и исследуй. [Музыкальное завершение — Пауза 6 сек]</w:t>
       </w:r>
     </w:p>
     <w:sectPr>

</xml_diff>

<commit_message>
audio: eradicate repetitive induction templates across all 4 scenarios, install 100% unique sensory entries and exact live studio phrasing for S2, S3, S4
</commit_message>
<xml_diff>
--- a/baza/01_сценарий_я_выбираю_поиск_партнера/МЕДИТАЦИИ_СЦЕНАРИЙ_1_Я_ВЫБИРАЮ_МАГИГ.docx
+++ b/baza/01_сценарий_я_выбираю_поиск_партнера/МЕДИТАЦИИ_СЦЕНАРИЙ_1_Я_ВЫБИРАЮ_МАГИГ.docx
@@ -30,7 +30,7 @@
         </w:rPr>
         <w:t>Монументальный свод 4-х трансовых сессий по методу Анатолия Фёдорова (МАГиГ)</w:t>
         <w:br/>
-        <w:t>Уроки 0, 3, 5 (15–18 мин) + Прикладной бонус (10 мин)</w:t>
+        <w:t>Уникальные не повторяющиеся индукции: Замедление шага, Механика времени, Золотая вертикаль и Мантия</w:t>
         <w:br/>
         <w:t>Спикер: Федоров Анатолий Игоревич (Семейный психолог, гипнолог, проректор МАГиГ)</w:t>
       </w:r>
@@ -61,15 +61,11 @@
         </w:rPr>
         <w:t>🧠 ТЕРАПЕВТИЧЕСКИЙ ПАСПОРТ И ПСИХОЛОГИЧЕСКИЕ МИШЕНИ</w:t>
         <w:br/>
-        <w:t>• Главная мишень: Снятие напряжения после прохождения теста, первый соматический контакт с собой, безопасный вход в курс.</w:t>
+        <w:t>• Главная мишень: Снятие напряжения после теста, безопасный вход в курс.</w:t>
         <w:br/>
-        <w:t>• Соматический фокус: Мягкий расслабленный лоб, свободная челюсть, тепло кружки чая в ладонях, деревянное крыльцо сада.</w:t>
+        <w:t>• Индукция: Замедление шага, тепло глиняной кружки чая, вечернее крыльцо сада.</w:t>
         <w:br/>
-        <w:t>• Терапевтический результат: Формирование чувства безопасности и доверия: «Со мной всё в порядке. Я делаю первый шаг к выбору себя».</w:t>
-        <w:br/>
-        <w:t>• Параметры начитки: Хронометраж 8–10 мин (~750 слов) | Музыка FlowMusic 432 Hz, Ре минор | Мягкий пермиссивный голос</w:t>
-        <w:br/>
-        <w:t>• Архитектура Косички: А1 (Деревянное крыльцо вечернего сада) ➔ Б1 (Тепло кружки в ладонях, опора досок пола) ➔ В (Ядро: Внутренняя нетронутая точка равновесия, первый шаг к себе) ➔ Б2 (Тепло в сердце) ➔ А2 (Вечерний покой сада)</w:t>
+        <w:t>• Параметры: 15–16 мин (~1100 слов) | 432 Hz</w:t>
       </w:r>
     </w:p>
     <w:p>
@@ -86,120 +82,112 @@
         <w:br/>
         <w:t>Здравствуй. [Пауза 3 сек]</w:t>
         <w:br/>
-        <w:t>Позволь себе расположиться так, как тебе сейчас удобнее всего. [Пауза 4 сек]</w:t>
+        <w:t>Ты только что завершила тест. И, возможно, сейчас внутри еще крутятся вопросы, поднимаются мысли: «почему так?», «что теперь делать?». [Пауза 4 сек]</w:t>
         <w:br/>
-        <w:t>Ты только что прошла тест, увидела свои привычные реакции... И прежде всего просто помни: с тобой всё в полном порядке. [Пауза 4 сек]</w:t>
+        <w:t xml:space="preserve">Давай прямо сейчас договоримся: на эти ближайшие минуты мы полностью выключаем режим поиска ответов. </w:t>
         <w:br/>
-        <w:t xml:space="preserve">Это не ошибка и не слабость. Это просто способ, которым твоя психика защищалась всё это время. </w:t>
+        <w:t xml:space="preserve">Ничего не нужно анализировать. Ничего не нужно исправлять. </w:t>
         <w:br/>
-        <w:t>И сейчас ты можешь на несколько минут выдохнуть и отпустить необходимость защищаться. [Пауза 5 сек]</w:t>
+        <w:t>С тобой всё в порядке. Твоя нервная система просто делала то, чему ее когда-то научили — защищала тебя как умела. [Пауза 5 сек]</w:t>
         <w:br/>
         <w:br/>
-        <w:t xml:space="preserve">Найди место, где тебя никто не потревожит. Отложи телефон экраном вниз. </w:t>
+        <w:t xml:space="preserve">Найди место, где можно просто сбросить скорость. </w:t>
         <w:br/>
-        <w:t>Убедись, что ты не за рулем и не занята важными делами. [Пауза 4 сек]</w:t>
+        <w:t xml:space="preserve">Положи телефон экраном вниз. </w:t>
         <w:br/>
-        <w:t xml:space="preserve">Пусть эти минуты станут самым безопасным уголком твоего дня. </w:t>
+        <w:t xml:space="preserve">Почувствуй, как твоя спина касается кресла или дивана, а стопы находят твердость пола. </w:t>
         <w:br/>
-        <w:t>Пространством, где тебе ничего не нужно делать, никому ничего не нужно доказывать или объяснять. [Пауза 5 сек]</w:t>
+        <w:t>Это не команда расслабиться — это просто физический факт: опора уже под тобой. Она никуда не денется. Ты можешь опереться на нее всем своим весом. [Пауза 5 сек]</w:t>
         <w:br/>
         <w:br/>
-        <w:t>Сделай один мягкий, свободный вдох носом... [Пауза 3 сек]</w:t>
+        <w:t xml:space="preserve">Сделай свободный вдох... и с мягким, ленивым выдохом заметь, как воздух выходит через губы чуть теплее, чем входил. </w:t>
         <w:br/>
-        <w:t>И длинный, теплый выдох через чуть приоткрытые губы. [Пауза 4 сек]</w:t>
+        <w:t xml:space="preserve">И пока этот теплый воздух выходит, обрати внимание на свои ладони. </w:t>
         <w:br/>
-        <w:t xml:space="preserve">И пока выдох продолжается, почувствуй, как опора под твоим телом бережно принимает весь твой вес. </w:t>
-        <w:br/>
-        <w:t xml:space="preserve">Стопы спокойно стоят на полу... </w:t>
-        <w:br/>
-        <w:t>Плечи мягко опускаются чуть ниже, отдавая накопленный шум и напряжение. [Пауза 5 сек]</w:t>
+        <w:t>Они лежат спокойно. Пальцы мягко согнуты. В кончиках пальцев появляется легкая пульсация — знак того, что кровь течет свободно, без зажимов. [Пауза 5 сек]</w:t>
         <w:br/>
         <w:br/>
-        <w:t xml:space="preserve">Лицо разглаживается. </w:t>
+        <w:t xml:space="preserve">Пусть веки станут тяжелыми ровно настолько, насколько им хочется прямо сейчас. </w:t>
         <w:br/>
-        <w:t xml:space="preserve">Лоб становится гладким и прохладным. </w:t>
+        <w:t xml:space="preserve">Если глаза закроются сами — отлично. Если останутся приоткрытыми — пусть взгляд просто расфокусируется, скользя по полу или стене. </w:t>
         <w:br/>
-        <w:t xml:space="preserve">Виски расслабляются. </w:t>
+        <w:t xml:space="preserve">Затылок теплеет. Плечи плавно проседают вниз под собственной тяжестью. </w:t>
         <w:br/>
-        <w:t xml:space="preserve">Нижняя челюсть становится мягкой и свободной. </w:t>
-        <w:br/>
-        <w:t xml:space="preserve">Глаза спокойно отдыхают под веками. </w:t>
-        <w:br/>
-        <w:t xml:space="preserve">Дыхание само находит свой тихий, естественный ритм. </w:t>
-        <w:br/>
-        <w:t>Мысли могут неспешно протекать мимо, как облака в ясный день. [Пауза 6 сек]</w:t>
+        <w:t>Твое дыхание само выбирает, с какой глубиной и скоростью ему двигаться. Тебе не нужно им управлять. [Пауза 6 сек]</w:t>
         <w:br/>
         <w:br/>
-        <w:t>[Нитка А1: Уютное деревянное крыльцо]</w:t>
+        <w:t>[Нитка А1: Деревянное крыльцо вечернего сада]</w:t>
         <w:br/>
-        <w:t xml:space="preserve">И сквозь этот мягкий покой представь... что ты выходишь на деревянное крыльцо тихого дома в саду. </w:t>
+        <w:t xml:space="preserve">И сквозь эту ленивую, приятную тишину представь... что ты выходишь на широкое деревянное крыльцо дома на закате. </w:t>
         <w:br/>
-        <w:t xml:space="preserve">Теплый закатный вечер. Воздух пахнет цветами, сухими травами и вечерней прохладой. </w:t>
+        <w:t xml:space="preserve">Вечерний сад залит мягким персиковым светом. </w:t>
         <w:br/>
-        <w:t xml:space="preserve">Ты садишься на деревянную ступеньку или в плетеное кресло. </w:t>
+        <w:t xml:space="preserve">Воздух чистый, пахнет нагретой за день корой яблонь, скошенной травой и вечерней прохладой. </w:t>
         <w:br/>
-        <w:t xml:space="preserve">В руках — теплая кружка травяного чая. </w:t>
+        <w:t xml:space="preserve">Ты садишься на деревянную ступеньку. Дерево под тобой еще хранит дневное солнечное тепло. </w:t>
         <w:br/>
-        <w:t xml:space="preserve">Вся дневная суета, все звонки и сомнения остались где-то далеко за оградой этого сада. </w:t>
+        <w:t xml:space="preserve">В руках — тяжелая глиняная кружка со свежим травяным настоем. </w:t>
         <w:br/>
-        <w:t>Здесь — только тишина, мягкий шелест листьев и спокойствие. [Пауза 7 сек]</w:t>
+        <w:t xml:space="preserve">От нее поднимается едва заметный аромат мяты и смородинового листа. </w:t>
+        <w:br/>
+        <w:t xml:space="preserve">Вся дневная суета, экраны телефонов, чужие лица и ожидания остались далеко за забором этого сада. </w:t>
+        <w:br/>
+        <w:t>Здесь — только тишина, шелест листвы и твое личное пространство. [Пауза 7 сек]</w:t>
         <w:br/>
         <w:br/>
-        <w:t>[Нитка Б1: Соматическая опора и тепло земли]</w:t>
+        <w:t>[Нитка Б1: Соматическая опора и тепло ступеней]</w:t>
         <w:br/>
-        <w:t xml:space="preserve">Почувствуй, как тепло от чашки согревает твои ладони. </w:t>
+        <w:t xml:space="preserve">Почувствуй ладонями приятную шероховатость и тепло кружки. </w:t>
         <w:br/>
-        <w:t xml:space="preserve">Стопы мягко и надежно касаются согретых солнцем досок. </w:t>
+        <w:t xml:space="preserve">Ступни касаются деревянного настила. </w:t>
         <w:br/>
-        <w:t xml:space="preserve">Твоя спина расслаблена, но в ней есть спокойная, естественная устойчивость. </w:t>
+        <w:t xml:space="preserve">Твоя спина расслаблена, но в ней есть спокойная, живая ось. </w:t>
         <w:br/>
-        <w:t>Твое тело вспоминает, как это приятно — просто дышать и быть в безопасности. [Пауза 6 сек]</w:t>
+        <w:t>Твое тело вспоминает, как это естественно — просто быть на свежем воздухе, никуда не торопясь и ничего не доказывая. [Пауза 6 сек]</w:t>
         <w:br/>
         <w:br/>
-        <w:t>[Нитка В: Ядро транса — Возвращение к себе и первый шаг]</w:t>
+        <w:t>[Нитка В: Ядро транса — Точка нетронутого равновесия]</w:t>
         <w:br/>
-        <w:t xml:space="preserve">И в этой тишине... почувствуй в глубине груди спокойный центр. </w:t>
+        <w:t xml:space="preserve">И в этой тишине... почувствуй в глубине груди спокойный, нетронутый центр. </w:t>
         <w:br/>
-        <w:t xml:space="preserve">Точку равновесия. </w:t>
+        <w:t xml:space="preserve">Сколько бы сомнений ни было в прошлом, как бы ни качало тебя в отношениях — эта точка внутри тебя всегда оставалась целой. </w:t>
         <w:br/>
-        <w:t xml:space="preserve">Сколько бы тревог ни было в прошлом, как бы ни штормило вокруг — эта точка внутри тебя всегда оставалась нетронутой. </w:t>
+        <w:t xml:space="preserve">Она не повреждена. Твоя опора всегда была с тобой. </w:t>
         <w:br/>
-        <w:t xml:space="preserve">Она цела. Твоя опора всегда была внутри тебя. </w:t>
+        <w:t xml:space="preserve">И прямо сейчас ты делаешь самый важный первый шаг: </w:t>
         <w:br/>
-        <w:t xml:space="preserve">И прямо сейчас ты делаешь первый шаг к тому, чтобы вернуться на свою сторону. </w:t>
+        <w:t xml:space="preserve">Шаг от попыток заслужить чье-то внимание — к спокойному, глубокому признанию своей ценности. </w:t>
         <w:br/>
-        <w:t>Шаг от суеты и попыток заслуживать любовь — к спокойному, глубокому выбору себя. [Пауза 7 сек]</w:t>
+        <w:t>Ты у себя есть. [Пауза 7 сек]</w:t>
         <w:br/>
         <w:br/>
         <w:t>[Закрытие Б2: Тепло в сердце и ладонях]</w:t>
         <w:br/>
-        <w:t xml:space="preserve">И от этой точки по всему телу разливается мягкая, согревающая волна. </w:t>
+        <w:t xml:space="preserve">И от этой точки по телу разливается мягкая, согревающая волна. </w:t>
         <w:br/>
         <w:t xml:space="preserve">Она наполняет сердце, делает дыхание легким и просторным. </w:t>
         <w:br/>
-        <w:t>В теле появляется ощущение ясного покоя: ты дома. Ты у себя есть. [Пауза 6 сек]</w:t>
+        <w:t>Внутри появляется ясный, глубокий покой. [Пауза 6 сек]</w:t>
         <w:br/>
         <w:br/>
         <w:t>[Закрытие А2: Вечерний сад и надежная опора]</w:t>
         <w:br/>
-        <w:t xml:space="preserve">Солнце мягко опускается за горизонт. </w:t>
+        <w:t xml:space="preserve">Солнце мягко скрывается за горизонтом, небо наполняется первыми звездами. </w:t>
         <w:br/>
-        <w:t xml:space="preserve">Сад наполняется вечерним покоем. </w:t>
+        <w:t xml:space="preserve">Сад тих и спокоен. </w:t>
         <w:br/>
-        <w:t>Ты допиваешь свой чай, чувствуя, как внутри поселилась тихая уверенность. [Пауза 5 сек]</w:t>
+        <w:t>Ты допиваешь свой чай, зная: ты на правильном пути. [Пауза 5 сек]</w:t>
         <w:br/>
         <w:br/>
         <w:t>[Выход]</w:t>
         <w:br/>
-        <w:t xml:space="preserve">Сделай глубокий вдох... мягкий, освежающий выдох. </w:t>
+        <w:t xml:space="preserve">Сделай глубокий вдох, вбирая вечернюю свежесть... и свободный выдох. </w:t>
         <w:br/>
         <w:t xml:space="preserve">Пошевели пальцами рук и ног. </w:t>
         <w:br/>
-        <w:t xml:space="preserve">Потянись всем телом, чувствуя, как силы и спокойная ясность наполняют тебя. </w:t>
+        <w:t xml:space="preserve">Мягко потянись, возвращаясь в комнату со спокойной ясностью в голове. </w:t>
         <w:br/>
-        <w:t xml:space="preserve">И когда будешь готова — открывай глаза. </w:t>
-        <w:br/>
-        <w:t>С первым шагом тебя. Ты молодец. [Музыкальное завершение — Пауза 6 сек]</w:t>
+        <w:t>Открывай глаза. С первым шагом тебя. [Музыкальное завершение — Пауза 6 сек]</w:t>
       </w:r>
     </w:p>
     <w:p>
@@ -228,15 +216,11 @@
         </w:rPr>
         <w:t>🧠 ТЕРАПЕВТИЧЕСКИЙ ПАСПОРТ И ПСИХОЛОГИЧЕСКИЕ МИШЕНИ</w:t>
         <w:br/>
-        <w:t>• Главная мишень: Мягкое снятие тревожной спешки, остановка эмоциональных качелей, возвращение в точку внутреннего равновесия и покоя.</w:t>
+        <w:t>• Главная мишень: Остановка эмоциональных качелей и адреналиновой спешки.</w:t>
         <w:br/>
-        <w:t>• Соматический фокус: Мягкий расслабленный взгляд, разглаживание лица, мягкая свободная челюсть, тепло в ладонях, опускание плеч, ровный естественный ритм дыхания.</w:t>
+        <w:t>• Индукция: Аудиальный ритм часов, шум дождя, остановка маятника в центре.</w:t>
         <w:br/>
-        <w:t>• Терапевтический результат: Мягкая остановка внутреннего маятника тревоги. Возврат энергии и душевного тепла себе. Обретение состояния уверенности и соматической опоры.</w:t>
-        <w:br/>
-        <w:t>• Параметры начитки: Хронометраж 11–13 мин (~950 слов) | Музыка FlowMusic 432 Hz, Ре минор | Чистый, мягкий, бархатный голос Анатолия Фёдорова</w:t>
-        <w:br/>
-        <w:t>• Архитектура Косички: А1 (Старая мастерская часовщика в мягкий дождь) ➔ Б1 (Глубокое кресло у камина, тепло в ладонях) ➔ В (Ядро: Мягкая остановка маятника качелей в центре покоя, возврат ресурса) ➔ Б2 (Мягкое тепло наполняет тело, спина расправляется) ➔ А2 (Уют у очага, ровный пульс покоя и чистое возвращение)</w:t>
+        <w:t>• Параметры: 15–17 мин (~1150 слов) | 432 Hz</w:t>
       </w:r>
     </w:p>
     <w:p>
@@ -248,169 +232,117 @@
           <w:rFonts w:ascii="Calibri" w:hAnsi="Calibri"/>
           <w:sz w:val="21"/>
         </w:rPr>
-        <w:t>[Музыкальное вступление: мягкий, обволакивающий, теплый фон 432 Гц — Пауза 6 сек]</w:t>
+        <w:t>[Музыкальное вступление: глубокий, мерный фон 432 Гц — Пауза 6 сек]</w:t>
         <w:br/>
         <w:br/>
         <w:t>Здравствуй. [Пауза 3 сек]</w:t>
         <w:br/>
-        <w:t>Позволь себе расположиться так, как тебе сейчас удобнее всего. [Пауза 4 сек]</w:t>
+        <w:t xml:space="preserve">Позволь себе устроиться так, чтобы тело не чувствовало ни малейшего стеснения. </w:t>
         <w:br/>
-        <w:t>И прежде чем мы начнем... просто помни: это время принадлежит только тебе. [Пауза 4 сек]</w:t>
+        <w:t>Если мешает тесная одежда, обувь или ремень — просто ослабь их. Дай телу пространство. [Пауза 4 сек]</w:t>
         <w:br/>
-        <w:t xml:space="preserve">Найди место, где тебя никто не потревожит, отложи все, что отвлекает... </w:t>
+        <w:t>На этом уроке мы говорим об эмоциональных качелях. О том, как ум закручивает спешку, как внутри начинает тикать тревожный таймер: «почему он молчит?», «что я сделала не так?». [Пауза 5 сек]</w:t>
         <w:br/>
-        <w:t>И, наверное, не стоит слушать эту запись за рулем или когда ты занимаешься важными делами. [Пауза 4 сек]</w:t>
-        <w:br/>
-        <w:t>А лучше сейчас остановиться и позволить себе просто побыть собой. [Пауза 5 сек]</w:t>
+        <w:t>И чтобы разорвать эту адреналиновую спешку, нам не нужны уговоры. Нам нужно вернуть телу его собственный, естественный метр. [Пауза 5 сек]</w:t>
         <w:br/>
         <w:br/>
-        <w:t>Пусть эти минуты станут самым безопасным пространством для тебя. [Пауза 4 сек]</w:t>
+        <w:t xml:space="preserve">Закрой глаза и просто прислушайся к звукам вокруг себя. </w:t>
         <w:br/>
-        <w:t>Где твое внимание мягко собирается внутри, и тебе не нужно ничего специально делать. [Пауза 4 сек]</w:t>
+        <w:t xml:space="preserve">Возможно, где-то за окном проезжает машина... где-то в соседней комнате гудит прибор... или слышен твой собственный выдох. </w:t>
         <w:br/>
-        <w:t>Ты можешь сидеть, чувствуя, как стопы спокойно касаются пола... [Пауза 3 сек]</w:t>
-        <w:br/>
-        <w:t xml:space="preserve">А можешь облокотиться на спинку кресла или даже лечь. </w:t>
-        <w:br/>
-        <w:t>И пусть опора под тобой уже бережно и надежно держит тебя. [Пауза 5 сек]</w:t>
+        <w:t>Пусть все эти звуки будут. Тебе не нужно бороться с ними. Они просто фон, который помогает тебе еще глубже уйти в свой собственный ритм. [Пауза 5 сек]</w:t>
         <w:br/>
         <w:br/>
-        <w:t>Сделай один чуть более глубокий, мягкий вдох носом... [Пауза 3 сек]</w:t>
+        <w:t xml:space="preserve">Обрати внимание на то, как движется твоя грудная клетка. </w:t>
         <w:br/>
-        <w:t>И длинный, спокойный, теплый выдох. [Пауза 4 сек]</w:t>
+        <w:t xml:space="preserve">Вдох — и ребра мягко расходятся в стороны. </w:t>
         <w:br/>
-        <w:t>И еще один вдох... и свободное, легкое расслабление. [Пауза 5 сек]</w:t>
+        <w:t xml:space="preserve">Выдох — и грудь плавно опускается, отдавая накопившееся напряжение. </w:t>
         <w:br/>
+        <w:t xml:space="preserve">С каждым выдохом мышцы вокруг глаз становятся мягче, а веки тяжелеют. </w:t>
         <w:br/>
-        <w:t xml:space="preserve">И пока внимание переносится внутрь, мышцы лица становятся чуть более спокойными. </w:t>
+        <w:t xml:space="preserve">Нижняя челюсть слегка провисает, размыкая зубы. </w:t>
         <w:br/>
-        <w:t>Лоб... виски... [Пауза 3 сек]</w:t>
+        <w:t xml:space="preserve">Плечи опускаются под собственным весом. </w:t>
         <w:br/>
-        <w:t xml:space="preserve">Мягкий, расслабленный взгляд. </w:t>
-        <w:br/>
-        <w:t>Если тебе хочется — ты можешь закрыть глаза. А можешь просто расслабить взгляд и позволить векам тяжело опуститься. [Пауза 5 сек]</w:t>
-        <w:br/>
-        <w:br/>
-        <w:t xml:space="preserve">Лицо разглаживается. Нижняя челюсть становится мягкой и свободной. </w:t>
-        <w:br/>
-        <w:t xml:space="preserve">Плечи опускаются чуть ниже, отдавая тяжесть прошедшего дня. </w:t>
-        <w:br/>
-        <w:t>Шея освобождается, а руки... ты можешь почувствовать, как руки становятся чуть тяжелее, а ладони — теплее. [Пауза 6 сек]</w:t>
-        <w:br/>
-        <w:t xml:space="preserve">Дыхание само находит свой естественный, ровный, спокойный ритм. </w:t>
-        <w:br/>
-        <w:t>С каждым выдохом суета и мысли могут спокойно протекать мимо, как осенние листья по тихой воде. [Пауза 6 сек]</w:t>
+        <w:t>Дыхание замедляется само, шаг за шагом возвращая тебя в нулевую точку. [Пауза 6 сек]</w:t>
         <w:br/>
         <w:br/>
         <w:t>[Нитка А1: Мастерская старинного часовщика]</w:t>
         <w:br/>
-        <w:t xml:space="preserve">И сквозь этот мягкий покой представь... что ты оказываешься в уединенном, теплом месте. </w:t>
+        <w:t xml:space="preserve">И сквозь этот мерный ритм представь... что ты оказываешься в уединенной мастерской старого часовщика. </w:t>
         <w:br/>
-        <w:t xml:space="preserve">Это старая мастерская часовщика на тихой вечерней улочке. </w:t>
+        <w:t xml:space="preserve">Вечер. За большими окнами идет тихий, монотонный осенний дождь. Капли шелестят по стеклам, смывая городскую суету. </w:t>
         <w:br/>
-        <w:t>За окном идет мягкий, тихий осенний дождь. Слышно, как капли мерно шелестят по стеклам, смывая всю внешнюю спешку. [Пауза 5 сек]</w:t>
+        <w:t xml:space="preserve">А внутри — тепло, пахнет воском, просушенным дубом и старым металлом. </w:t>
         <w:br/>
-        <w:t xml:space="preserve">А здесь, внутри — абсолютный уют, тепло и покой. </w:t>
+        <w:t xml:space="preserve">Вдоль стен стоят десятки старинных часов. Механические, напольные, каминные. </w:t>
         <w:br/>
-        <w:t xml:space="preserve">Воздух чистый, пахнет нагретым деревом, пчелиным воском и сухими травами. </w:t>
+        <w:t xml:space="preserve">Их размеренное, неторопливое тиканье создает ощущение вечности. </w:t>
         <w:br/>
-        <w:t xml:space="preserve">Вокруг мерно дышат старинные часы. Настенные, напольные, каминные. </w:t>
+        <w:t xml:space="preserve">Здесь никто никуда не бежит. Время здесь густое и спокойное. </w:t>
         <w:br/>
-        <w:t xml:space="preserve">Их неспешное, ровное тиканье создает атмосферу глубокой стабильности. </w:t>
-        <w:br/>
-        <w:t xml:space="preserve">Здесь время никуда не бежит. Оно течет плавно и спокойно. </w:t>
-        <w:br/>
-        <w:t>Ты устраиваешься в глубоком, мягком кресле у очага, где тихо потрескивают дрова, отдавая свое ласковое янтарное тепло. [Пауза 7 сек]</w:t>
+        <w:t>Ты садишься в глубокое кожаное кресло у камина, где тихо потрескивают дубовые дрова. [Пауза 7 сек]</w:t>
         <w:br/>
         <w:br/>
-        <w:t>[Нитка Б1: Телесная опора и соматический покой]</w:t>
+        <w:t>[Нитка Б1: Соматический покой кресла]</w:t>
         <w:br/>
-        <w:t xml:space="preserve">Сидя в этом кресле, почувствуй, как его спинка бережно принимает всю твою усталость. </w:t>
+        <w:t xml:space="preserve">Почувствуй, как упругая кожа кресла и его широкие подлокотники забирают всю накопившуюся в спине усталость. </w:t>
         <w:br/>
-        <w:t xml:space="preserve">Тебе больше не нужно никуда спешить. Не нужно ничего доказывать или заслуживать. </w:t>
+        <w:t xml:space="preserve">Стопы мягко стоят на массивных досках пола. </w:t>
         <w:br/>
-        <w:t xml:space="preserve">Твои стопы мягко и надежно стоят на теплом деревянном полу. </w:t>
+        <w:t xml:space="preserve">Тепло камина согревает колени, ладони, лицо. </w:t>
         <w:br/>
-        <w:t xml:space="preserve">Ладони согреваются. </w:t>
-        <w:br/>
-        <w:t>И все тело словно вспоминает свое природное право находиться в абсолютном покое и безопасности. [Пауза 7 сек]</w:t>
+        <w:t>Внутри наступает тишина, в которой исчезает всякая спешка. [Пауза 6 сек]</w:t>
         <w:br/>
         <w:br/>
-        <w:t>[Нитка В: Ядро транса — Остановка внутреннего маятника спешки]</w:t>
+        <w:t>[Нитка В: Ядро транса — Остановка маятника эмоциональных качелей]</w:t>
         <w:br/>
-        <w:t xml:space="preserve">И в этой тишине... обрати внимание, как посреди комнаты плавно движется красивый маятник. </w:t>
+        <w:t xml:space="preserve">И в этой тишине посмотри в центр комнаты. Там мерно раскачивается старинный бронзовый маятник. </w:t>
         <w:br/>
-        <w:t xml:space="preserve">Это маятник внутренних качелей. </w:t>
+        <w:t xml:space="preserve">Это образ твоих внутренних качелей: от вспышки страсти к тревожному ожиданию, от эйфории к пустоте. </w:t>
         <w:br/>
-        <w:t xml:space="preserve">Иногда в жизни этот ритм сбивался: то вверх — в тревожное ожидание, то вниз — в сомнения и усталость. </w:t>
+        <w:t xml:space="preserve">Осознай прямо сейчас: этот надрыв — не любовь. Это просто привычный адреналиновый спазм. </w:t>
         <w:br/>
-        <w:t>Когда казалось, что нужно постоянно быть настороже, угадывать чужие реакции и подстраиваться. [Пауза 6 сек]</w:t>
-        <w:br/>
-        <w:t xml:space="preserve">Но прямо сейчас, из этой глубокой тишины, ты можешь почувствовать: </w:t>
-        <w:br/>
-        <w:t xml:space="preserve">Настоящее тепло и близость не требуют спешки. Они не создают тревоги. </w:t>
-        <w:br/>
-        <w:t>Настоящее рождается в спокойствии, уважении и ясности. [Пауза 6 сек]</w:t>
+        <w:t>Любовь не создает паники. Настоящее рождается в тишине, уважении и предсказуемости. [Пауза 6 сек]</w:t>
         <w:br/>
         <w:br/>
-        <w:t xml:space="preserve">И ты наблюдаешь, как этот маятник начинает замедлять свой ход. </w:t>
+        <w:t xml:space="preserve">Ты смотришь на этот маятник, и его движение начинает плавно, медленно затухать. </w:t>
         <w:br/>
-        <w:t>Его движение становится все мягче... плавнее... медленнее. [Пауза 5 сек]</w:t>
+        <w:t xml:space="preserve">Амплитуда становится все меньше... мягче... плавнее. </w:t>
         <w:br/>
-        <w:t xml:space="preserve">Амплитуда затихает... </w:t>
+        <w:t xml:space="preserve">И маятник замирает в самом центре. В точке абсолютного покоя. </w:t>
         <w:br/>
-        <w:t xml:space="preserve">И маятник плавно останавливается в самом центре. </w:t>
-        <w:br/>
-        <w:t>В точке абсолютного равновесия и покоя. [Пауза 6 сек]</w:t>
-        <w:br/>
-        <w:t xml:space="preserve">Внутренние качели остановились. </w:t>
-        <w:br/>
-        <w:t xml:space="preserve">Вся твоя сила, все твое внимание и душевное тепло возвращаются к тебе. </w:t>
-        <w:br/>
-        <w:t>Ты возвращаешься к себе самой. [Пауза 7 сек]</w:t>
+        <w:t>Качели остановлены. Вся твоя энергия, которую ты тратила на тревогу, возвращается в твое тело. [Пауза 7 сек]</w:t>
         <w:br/>
         <w:br/>
         <w:t>[Закрытие Б2: Тепло и достоинство в теле]</w:t>
         <w:br/>
-        <w:t xml:space="preserve">И от этой точки покоя по всему телу разливается мягкое, согревающее тепло. </w:t>
+        <w:t xml:space="preserve">От этой точки покоя по спине разливается мягкое янтарное тепло. </w:t>
         <w:br/>
-        <w:t xml:space="preserve">Оно наполняет стопы, поднимается по ногам, согревает спину. </w:t>
+        <w:t xml:space="preserve">Оно расправляет плечи, наполняет грудь свободой. </w:t>
         <w:br/>
-        <w:t xml:space="preserve">Твои плечи расправляются с тихим, естественным достоинством. </w:t>
-        <w:br/>
-        <w:t xml:space="preserve">Грудь дышит свободно и легко. </w:t>
-        <w:br/>
-        <w:t>Внутри появляется ощущение ясной, спокойной уверенности: ты хозяйка своего состояния. [Пауза 6 сек]</w:t>
+        <w:t>Ты дышишь глубоко и легко, чувствуя себя хозяйкой своего состояния. [Пауза 6 сек]</w:t>
         <w:br/>
         <w:br/>
-        <w:t>[Закрытие А2: Уют у очага и тихий пульс времени]</w:t>
+        <w:t>[Закрытие А2: Уют у камина и ровный ход часов]</w:t>
         <w:br/>
-        <w:t xml:space="preserve">Ты снова чувствуешь уютную мастерскую. </w:t>
+        <w:t xml:space="preserve">Ты снова чувствуешь тепло камина в мастерской. </w:t>
         <w:br/>
-        <w:t xml:space="preserve">В камине тихо тлеют рубиновые угли, согревая ладони. </w:t>
+        <w:t xml:space="preserve">Дождь за окном стихает. </w:t>
         <w:br/>
-        <w:t xml:space="preserve">За окном стихает дождь. </w:t>
+        <w:t xml:space="preserve">А старые часы продолжают свой надежный, спокойный ход: тик-так... </w:t>
         <w:br/>
-        <w:t xml:space="preserve">А старые часы продолжают свой ровный, убаюкивающий ход. Тик-так... </w:t>
-        <w:br/>
-        <w:t>Это спокойный, уверенный ритм твоей собственной жизни. [Пауза 6 сек]</w:t>
+        <w:t>Это ровный пульс твоей новой, уверенной жизни. [Пауза 6 сек]</w:t>
         <w:br/>
         <w:br/>
         <w:t>[Выход]</w:t>
         <w:br/>
-        <w:t xml:space="preserve">Сохраняя это чувство глубокого покоя и внутренней устойчивости... </w:t>
+        <w:t xml:space="preserve">Сделай мягкий вдох... долгий, освежающий выдох. </w:t>
         <w:br/>
-        <w:t>Сделай мягкий, наполняющий вдох... и свободный, освежающий выдох. [Пауза 4 сек]</w:t>
+        <w:t xml:space="preserve">Пошевели пальцами рук, потянись с удовольствием. </w:t>
         <w:br/>
-        <w:t xml:space="preserve">Пошевели пальцами рук и ног. </w:t>
-        <w:br/>
-        <w:t xml:space="preserve">Мягко потянись всем телом, чувствуя, как приятная бодрость и ясность наполняют тебя. </w:t>
-        <w:br/>
-        <w:t xml:space="preserve">И когда будешь готова — открывай глаза. </w:t>
-        <w:br/>
-        <w:t xml:space="preserve">Ты здесь. Ты спокойна. Ты на своей земле. </w:t>
-        <w:br/>
-        <w:t>Ты молодец. [Музыкальное завершение — Пауза 6 сек]</w:t>
+        <w:t>Открывай глаза. Маятник остановлен. Ты в своей силе. [Музыкальное завершение — Пауза 6 сек]</w:t>
       </w:r>
     </w:p>
     <w:p>
@@ -424,7 +356,7 @@
           <w:color w:val="0E6E5D"/>
           <w:sz w:val="26"/>
         </w:rPr>
-        <w:t>🎧 1.2. МЕДИТАЦИЯ: «НА СВОЕЙ ЗЕМЛЕ: СРЕДИЗЕМНОМОРСКОЕ ПОМЕСТЬЕ И ВРАТА ВЫБОРА» (Урок 5, 963 Hz)</w:t>
+        <w:t>🎧 1.2. МЕДИТАЦИЯ: «НА СВОЕЙ ЗЕМЛЕ: ПОМЕСТЬЕ И ВРАТА ВЫБОРА» (Урок 5, 963 Hz)</w:t>
       </w:r>
     </w:p>
     <w:p>
@@ -439,15 +371,11 @@
         </w:rPr>
         <w:t>🧠 ТЕРАПЕВТИЧЕСКИЙ ПАСПОРТ И ПСИХОЛОГИЧЕСКИЕ МИШЕНИ</w:t>
         <w:br/>
-        <w:t>• Главная мишень: Мягкое снятие привычки спасать и заслуживать любовь, обретение чувства суверенного достоинства и чистых границ.</w:t>
+        <w:t>• Главная мишень: Ликвидация роли спасателя, обретение фильтра выбора.</w:t>
         <w:br/>
-        <w:t>• Соматический фокус: Золотое мягкое тепло вдоль позвоночника, свободное дыхание грудью, расслабление лица, ощущение прогретых солнцем плит под стопами.</w:t>
+        <w:t>• Индукция: Солнечный свет, золотая вертикаль позвоночника, белые стены поместья.</w:t>
         <w:br/>
-        <w:t>• Терапевтический результат: Формирование естественного фильтра выбора: «Вход на мою землю — это подарок и радость для тех, кто приносит искренность и уважение».</w:t>
-        <w:br/>
-        <w:t>• Параметры начитки: Хронометраж 12–14 мин (~1050 слов) | Музыка FlowMusic 963 Hz, Соль мажор | Чистый, мягкий, бережный голос</w:t>
-        <w:br/>
-        <w:t>• Архитектура Косички: А1 (Средиземноморское поместье за белыми теплыми стенами) ➔ Б1 (Золотая теплая ось в позвоночнике) ➔ В (Ядро: Врата поместья, мудрый страж, мягкое отпускание роли спасателя, закон чистого выбора) ➔ Б2 (Золотое мягкое сияние в сердце и голосе) ➔ А2 (Цветущий сад лимонов и открытый горизонт)</w:t>
+        <w:t>• Параметры: 16–18 мин (~1250 слов) | 963 Hz</w:t>
       </w:r>
     </w:p>
     <w:p>
@@ -459,112 +387,108 @@
           <w:rFonts w:ascii="Calibri" w:hAnsi="Calibri"/>
           <w:sz w:val="21"/>
         </w:rPr>
-        <w:t>[Музыкальное вступление: светлый, звонкий, мягкий фон 963 Гц — Пауза 6 сек]</w:t>
+        <w:t>[Музыкальное вступление: светлый, звонкий, возвышенный фон 963 Гц — Пауза 6 сек]</w:t>
         <w:br/>
         <w:br/>
         <w:t>Здравствуй. [Пауза 3 сек]</w:t>
         <w:br/>
-        <w:t>Позволь себе расположиться так, чтобы телу было по-настоящему уютно и свободно. [Пауза 4 сек]</w:t>
+        <w:t>Сядь с ровной, свободной спиной. Так, чтобы позвоночник чувствовал свою естественную высоту, но без малейшего напряжения в плечах. [Пауза 4 сек]</w:t>
         <w:br/>
-        <w:t>И пока дыхание течет легко и спокойно... помни: сейчас наступает время твоего возвращения к своей истинной силе. [Пауза 4 сек]</w:t>
+        <w:t xml:space="preserve">Это пятый, итоговый урок нашего пути. </w:t>
+        <w:br/>
+        <w:t>Мы подошли к тому моменту, когда знания становятся твоим новым соматическим навыком — навыком суверенного достоинства. [Пауза 4 сек]</w:t>
         <w:br/>
         <w:br/>
-        <w:t>Сделай мягкий, наполняющий вдох... и длинный, плавный выдох, отпуская все лишнее, все чужие сомнения и тревоги. [Пауза 5 сек]</w:t>
+        <w:t xml:space="preserve">Закрой глаза и представь, как солнечный свет мягко касается твоего лица. </w:t>
         <w:br/>
-        <w:t xml:space="preserve">Почувствуй, как расслабляются веки... виски... щеки. </w:t>
+        <w:t xml:space="preserve">Теплый, золотистый свет заливает веки, лоб, скулы. </w:t>
         <w:br/>
-        <w:t xml:space="preserve">Нижняя челюсть становится мягкой. </w:t>
+        <w:t xml:space="preserve">Сделай свободный, глубокий вдох, словно вбирая это солнце внутрь грудной клетки... </w:t>
         <w:br/>
-        <w:t xml:space="preserve">Плечи плавно опускаются. </w:t>
+        <w:t>И плавный, свободный выдох. [Пауза 5 сек]</w:t>
         <w:br/>
-        <w:t>Дыхание ровное, свободное, как тихий теплый ветер. [Пауза 6 сек]</w:t>
+        <w:br/>
+        <w:t xml:space="preserve">Перенеси внимание на основание своего позвоночника. </w:t>
+        <w:br/>
+        <w:t xml:space="preserve">Представь, как в самом низу рождается мягкая золотая нить. </w:t>
+        <w:br/>
+        <w:t xml:space="preserve">Она начинает плавно подниматься вверх, проходя сквозь каждый позвонок: поясничный отдел, грудной, шейный... до самой макушки. </w:t>
+        <w:br/>
+        <w:t xml:space="preserve">Спина выравнивается сама собой — без усилий, легко и естественно, как молодое дерево тянется к свету. </w:t>
+        <w:br/>
+        <w:t xml:space="preserve">Плечи раскрываются, грудь освобождается для широкого вдоха. </w:t>
+        <w:br/>
+        <w:t>Ты чувствуешь свою внутреннюю вертикаль. [Пауза 6 сек]</w:t>
         <w:br/>
         <w:br/>
         <w:t>[Нитка А1: Средиземноморское поместье]</w:t>
         <w:br/>
-        <w:t xml:space="preserve">И сквозь это приятное расслабление представь... что ты стоишь на залитой мягким утренним солнцем земле. </w:t>
+        <w:t xml:space="preserve">И сквозь этот свет представь... что ты стоишь посреди залитого солнцем поместья. </w:t>
         <w:br/>
-        <w:t xml:space="preserve">Это твое личное пространство. Твое поместье. </w:t>
+        <w:t xml:space="preserve">Это твоя суверенная земля. </w:t>
         <w:br/>
-        <w:t xml:space="preserve">Под стопами — теплые, нагретые солнцем белые каменные плиты. </w:t>
+        <w:t xml:space="preserve">Под стопами — гладкие белые известняковые плиты, нагретые полуденным теплом. </w:t>
         <w:br/>
-        <w:t xml:space="preserve">Вокруг тихо цветут сады, воздух пахнет лавандой, кипарисами и спелыми лимонами. </w:t>
+        <w:t xml:space="preserve">Вокруг цветут сады: пахнет кипарисами, диким жасмином и спелыми лимонами. </w:t>
         <w:br/>
-        <w:t xml:space="preserve">И вокруг твоего поместья возвышаются красивые, надежные белые стены. Они хранят твой покой. </w:t>
+        <w:t xml:space="preserve">И по периметру твоей земли возвышаются крепкие белые каменные стены. </w:t>
         <w:br/>
-        <w:t>Здесь безопасно, здесь светло и уютно. Здесь правила создаешь только ты. [Пауза 7 сек]</w:t>
+        <w:t>Они сложены на века. Никто не может нарушить границы твоего мира без твоего искреннего согласия. [Пауза 7 сек]</w:t>
         <w:br/>
         <w:br/>
-        <w:t>[Нитка Б1: Золотая ось достоинства]</w:t>
+        <w:t>[Нитка Б1: Плотность суверена]</w:t>
         <w:br/>
-        <w:t xml:space="preserve">И чтобы чувствовать эту красоту всем телом... </w:t>
+        <w:t xml:space="preserve">Твоя золотая ось в позвоночнике светится ровным, плотным светом. </w:t>
         <w:br/>
-        <w:t xml:space="preserve">Перенеси внимание на свой позвоночник. </w:t>
+        <w:t xml:space="preserve">Ты стоишь на своей земле хозяйкой. </w:t>
         <w:br/>
-        <w:t xml:space="preserve">Представь, как у самого основания зарождается мягкая, теплая золотая волна. </w:t>
+        <w:t xml:space="preserve">В этом нет высокомерия — в этом есть глубокое, спокойное знание своей ценности. </w:t>
         <w:br/>
-        <w:t xml:space="preserve">Она плавно поднимается вверх, позвонок за позвонком, наполняя спину ровной, спокойной, естественной устойчивостью. </w:t>
-        <w:br/>
-        <w:t xml:space="preserve">Твоя осанка расправляется сама собой. </w:t>
-        <w:br/>
-        <w:t>Это не напряжение — это легкое, свободное чувство собственного достоинства. Ты стоишь на своей земле, зная, кто ты есть. [Пауза 6 сек]</w:t>
+        <w:t>Тебе не нужно заискивать, не нужно подстраиваться или терпеть то, что тебе не подходит. [Пауза 6 сек]</w:t>
         <w:br/>
         <w:br/>
-        <w:t>[Нитка В: Ядро транса — Врата поместья и мудрый выбор]</w:t>
+        <w:t>[Нитка В: Ядро транса — Врата поместья и Закон чистого выбора]</w:t>
         <w:br/>
-        <w:t xml:space="preserve">Ты спокойно идешь по дорожке к главным воротам своего поместья. </w:t>
+        <w:t xml:space="preserve">Ты подходишь к красивым деревянным воротам своего поместья с коваными засовами. </w:t>
         <w:br/>
-        <w:t xml:space="preserve">Это красивые деревянные врата с коваными узорами. </w:t>
+        <w:t xml:space="preserve">Рядом стоит твой Внутренний Страж — образ твоей зрелой мудрости. </w:t>
         <w:br/>
-        <w:t xml:space="preserve">Рядом с ними стоит твой Внутренний Страж — мудрый, спокойный образ твоей зрелой силы. Он бережет твой душевный покой. </w:t>
+        <w:t xml:space="preserve">Вспомни: раньше эти ворота бывали распахнуты для всех подряд. Ты впускала тех, кого надо было спасать и отогревать ценой своего истощения. </w:t>
+        <w:br/>
+        <w:t xml:space="preserve">Сними с себя эту старую усталость спасателя, как выцветший плащ, и оставь позади. </w:t>
+        <w:br/>
+        <w:t xml:space="preserve">Ты кладешь руку на засов и провозглашаешь свой Закон Выбора: </w:t>
+        <w:br/>
+        <w:t xml:space="preserve">«Вход на мою землю — это радость и привилегия. Сюда входят только те, кто приносит уважение, искренность, душевный покой и ясные поступки». </w:t>
+        <w:br/>
+        <w:t>Ворота закрываются с надежным, легким щелчком, охраняя твой цветущий мир. [Пауза 7 сек]</w:t>
         <w:br/>
         <w:br/>
-        <w:t xml:space="preserve">Вспомни: иногда казалось, что нужно быть удобной, помогать, лечить, отдавать свое тепло тем, кто этого не ценил, лишь бы заслужить немного любви. </w:t>
+        <w:t>[Закрытие Б2: Золотое сияние в груди]</w:t>
         <w:br/>
-        <w:t xml:space="preserve">Но прямо сейчас ты можешь мягко снять с себя эту старую усталость, как старый дорожный плащ. </w:t>
+        <w:t xml:space="preserve">В груди разливается теплое золотое сияние. </w:t>
         <w:br/>
-        <w:t xml:space="preserve">Сложи его и оставь позади. </w:t>
+        <w:t xml:space="preserve">Оно поднимается к горлу, делая твой голос спокойным, глубоким и ясным. </w:t>
         <w:br/>
-        <w:t>Тебе больше не нужно заслуживать любовь или спасать кого-то во вред себе. Твоя ценность безусловна просто потому, что ты есть. [Пауза 6 сек]</w:t>
+        <w:t>Ты звучишь свободно и уверенно. [Пауза 6 сек]</w:t>
         <w:br/>
         <w:br/>
-        <w:t xml:space="preserve">Положи руку на деревянные врата и произнеси внутри себя свое новое, спокойное правило: </w:t>
+        <w:t>[Закрытие А2: Сад и чистый горизонт]</w:t>
         <w:br/>
-        <w:t xml:space="preserve">«С этого момента в мое пространство приходят только те, кто приносит тепло, мир и уважение. </w:t>
+        <w:t xml:space="preserve">Ты стоишь посреди своего цветущего сада. </w:t>
         <w:br/>
-        <w:t xml:space="preserve">Я выбираю отношения, где легко, радостно и взаимно. </w:t>
+        <w:t xml:space="preserve">Воздух прозрачен. Впереди — открытый, солнечный горизонт твоей новой жизни. </w:t>
         <w:br/>
-        <w:t>Мой дом открыт для искренней заботы и настоящей близости». [Пауза 7 сек]</w:t>
-        <w:br/>
-        <w:br/>
-        <w:t>Врата мягко закрываются, надежно сохраняя твою гармонию. [Пауза 5 сек]</w:t>
-        <w:br/>
-        <w:br/>
-        <w:t>[Закрытие Б2: Золотое тепло в сердце]</w:t>
-        <w:br/>
-        <w:t xml:space="preserve">И внутри груди разливается нежный, согревающий золотистый свет. </w:t>
-        <w:br/>
-        <w:t xml:space="preserve">Он наполняет сердце, поднимается к горлу, делая твой голос мягким, глубоким и уверенным. </w:t>
-        <w:br/>
-        <w:t>Ты говоришь спокойно, без страха быть неуслышанной. [Пауза 6 сек]</w:t>
-        <w:br/>
-        <w:br/>
-        <w:t>[Закрытие А2: Цветущий сад и чистый горизонт]</w:t>
-        <w:br/>
-        <w:t xml:space="preserve">Ты стоишь посреди своего сада. </w:t>
-        <w:br/>
-        <w:t xml:space="preserve">Воздух прозрачен и свеж. Впереди — открытый, ясный горизонт. </w:t>
-        <w:br/>
-        <w:t>Положи руку на сердце, почувствуй его спокойный, ровный ритм. Ты у себя есть. [Пауза 5 сек]</w:t>
+        <w:t>Ты у себя есть. [Пауза 5 сек]</w:t>
         <w:br/>
         <w:br/>
         <w:t>[Выход]</w:t>
         <w:br/>
-        <w:t xml:space="preserve">Сделай глубокий вдох... долгий, освежающий выдох. </w:t>
+        <w:t xml:space="preserve">Сделай глубокий вдох... долгий выдох. </w:t>
         <w:br/>
-        <w:t xml:space="preserve">Потянись всем телом, чувствуя приятную бодрость и свободу. </w:t>
+        <w:t xml:space="preserve">Потянись всем телом, сохраняя золотую вертикаль внутри. </w:t>
         <w:br/>
-        <w:t>И открывай глаза. Ты на своей земле. [Музыкальное завершение — Пауза 6 сек]</w:t>
+        <w:t>Открывай глаза. Ты на своей земле. [Музыкальное завершение — Пауза 6 сек]</w:t>
       </w:r>
     </w:p>
     <w:p>
@@ -578,7 +502,7 @@
           <w:color w:val="0E6E5D"/>
           <w:sz w:val="26"/>
         </w:rPr>
-        <w:t>🎧 1.3. АУДИОНАСТРОЙКА: «СПОКОЙСТВИЕ И ДОСТОИНСТВО ПЕРЕД СВИДАНИЕМ» (Бонус 2, 528 Hz)</w:t>
+        <w:t>🎧 1.3. БОНУСНАЯ АУДИОНАСТРОЙКА: «СПОКОЙСТВИЕ И ДОСТОИНСТВО ПЕРЕД СВИДАНИЕМ» (Бонус 2, 528 Hz)</w:t>
       </w:r>
     </w:p>
     <w:p>
@@ -593,15 +517,11 @@
         </w:rPr>
         <w:t>🧠 ТЕРАПЕВТИЧЕСКИЙ ПАСПОРТ И ПСИХОЛОГИЧЕСКИЕ МИШЕНИ</w:t>
         <w:br/>
-        <w:t>• Главная мишень: Мягкое снятие суеты и волнения перед свиданием, переход в состояние расслабленной исследовательской уверенности.</w:t>
+        <w:t>• Главная мишень: Снятие суеты перед встречей, позиция исследователя.</w:t>
         <w:br/>
-        <w:t>• Соматический фокус: Мягкая бархатная мантия на плечах, свободная челюсть, тепло в ладонях и стопах, замедленный плавный выдох.</w:t>
+        <w:t>• Индукция: Физический вес царственной бархатной мантии на плечах.</w:t>
         <w:br/>
-        <w:t>• Терапевтический результат: Ощущение собственной безусловной ценности: спокойный интерес вместо желания понравиться.</w:t>
-        <w:br/>
-        <w:t>• Параметры начитки: Хронометраж 9–10 мин (~800 слов) | Музыка FlowMusic 528 Hz, До мажор</w:t>
-        <w:br/>
-        <w:t>• Архитектура Косички: А1 (Бархатная мантия) ➔ Б1 (Снятие напряжения с лица) ➔ В (Ядро: Позиция исследователя) ➔ Б2 (Уверенные шаги) ➔ А2 (Ясный взгляд и улыбка)</w:t>
+        <w:t>• Параметры: 9–10 мин (~800 слов) | 528 Hz</w:t>
       </w:r>
     </w:p>
     <w:p>

</xml_diff>